<commit_message>
Withdraw v1.6.0 so it can be released as 1.5.1
Releases bump the patch number only. v1.6.0's tag and GitHub release are
deleted; this puts <Version>, the Unreleased notes, Published_Docs and
Sbom back as they were before the release, and renames the Upgrade Guide
row to 1.5.1.

Co-Authored-By: Claude Opus 5.5 <noreply@anthropic.com>
</commit_message>
<xml_diff>
--- a/Published_Docs/Installation_Guide.docx
+++ b/Published_Docs/Installation_Guide.docx
@@ -1058,71 +1058,6 @@
                 <w:rFonts w:ascii="Consolas" w:hAnsi="Consolas"/>
                 <w:sz w:val="19"/>
               </w:rPr>
-              <w:t>-InstallSqlServerAudit</w:t>
-            </w:r>
-          </w:p>
-        </w:tc>
-        <w:tc>
-          <w:tcPr>
-            <w:tcW w:type="dxa" w:w="2880"/>
-          </w:tcPr>
-          <w:p>
-            <w:r>
-              <w:t xml:space="preserve">Whether the </w:t>
-            </w:r>
-            <w:r>
-              <w:rPr>
-                <w:rFonts w:ascii="Consolas" w:hAnsi="Consolas"/>
-                <w:sz w:val="19"/>
-              </w:rPr>
-              <w:t>Db.SqlServerAudit</w:t>
-            </w:r>
-            <w:r>
-              <w:t xml:space="preserve"> step records every change to or deletion of audit entries in the Windows Security log (a SQL Server audit). With SQL Server on this server it also sets the Windows audit policy *Application Generated* and gives the SQL Server service account the *Generate security audits* right and access to the Security log. </w:t>
-            </w:r>
-            <w:r>
-              <w:rPr>
-                <w:b/>
-              </w:rPr>
-              <w:t>Restart the SQL Server service afterwards</w:t>
-            </w:r>
-            <w:r>
-              <w:t xml:space="preserve"> when the step says so (it doesn't restart it for you), then run </w:t>
-            </w:r>
-            <w:r>
-              <w:rPr>
-                <w:rFonts w:ascii="Consolas" w:hAnsi="Consolas"/>
-                <w:sz w:val="19"/>
-              </w:rPr>
-              <w:t>-Step Db.SqlServerAudit</w:t>
-            </w:r>
-            <w:r>
-              <w:t xml:space="preserve"> again to check it's recording. With SQL Server elsewhere, that server's administrator does the Windows part (Admin_OperationsGuide.md, "Audit Log Seals and the SQL Server Audit").</w:t>
-            </w:r>
-          </w:p>
-        </w:tc>
-        <w:tc>
-          <w:tcPr>
-            <w:tcW w:type="dxa" w:w="2880"/>
-          </w:tcPr>
-          <w:p>
-            <w:r>
-              <w:t>prompted (yes)</w:t>
-            </w:r>
-          </w:p>
-        </w:tc>
-      </w:tr>
-      <w:tr>
-        <w:tc>
-          <w:tcPr>
-            <w:tcW w:type="dxa" w:w="2880"/>
-          </w:tcPr>
-          <w:p>
-            <w:r>
-              <w:rPr>
-                <w:rFonts w:ascii="Consolas" w:hAnsi="Consolas"/>
-                <w:sz w:val="19"/>
-              </w:rPr>
               <w:t>-ResetIis</w:t>
             </w:r>
           </w:p>
@@ -2110,7 +2045,7 @@
         <w:t>Re-run `Db.AppPoolAccess` on an existing install after upgrading</w:t>
       </w:r>
       <w:r>
-        <w:t xml:space="preserve">: the grants it applies change from time to time. The current version makes the audit log and its seals append-only for the app's account (it can add audit entries and seals but not change or delete them) and adds </w:t>
+        <w:t xml:space="preserve">: the grants it applies change from time to time. The current version makes the audit log append-only for the app's account (it can add audit entries but not change or delete them) and adds </w:t>
       </w:r>
       <w:r>
         <w:rPr>

</xml_diff>